<commit_message>
Use full legal entity name Leadership Flow Technologies, LLC
Update company name across the Terms, Privacy Policy (pages + Word docs),
LICENSE, and login/signup copyright notices.

Co-Authored-By: Claude Sonnet 5 <noreply@anthropic.com>
Claude-Session: https://claude.ai/code/session_01VRzLkbYQSAzFtEAeBdbs5f
</commit_message>
<xml_diff>
--- a/Accountability-App-Privacy-Policy.docx
+++ b/Accountability-App-Privacy-Policy.docx
@@ -98,7 +98,7 @@
           <w:sz w:val="21"/>
           <w:szCs w:val="21"/>
         </w:rPr>
-        <w:t xml:space="preserve">This Privacy Policy explains how Leadership Flow ("we", "us", "our") collects, uses, shares, and protects personal information when you use the Accountability App (the "Service"). By using the Service, you agree to this Policy.</w:t>
+        <w:t xml:space="preserve">This Privacy Policy explains how Leadership Flow Technologies, LLC ("we", "us", "our") collects, uses, shares, and protects personal information when you use the Accountability App (the "Service"). By using the Service, you agree to this Policy.</w:t>
       </w:r>
     </w:p>
     <w:p>
@@ -600,7 +600,7 @@
           <w:sz w:val="18"/>
           <w:szCs w:val="18"/>
         </w:rPr>
-        <w:t xml:space="preserve">Leadership Flow  ·  https://www.accountability-app.com  ·  hectorg@accountability-app.com</w:t>
+        <w:t xml:space="preserve">Leadership Flow Technologies, LLC  ·  https://www.accountability-app.com  ·  hectorg@accountability-app.com</w:t>
       </w:r>
     </w:p>
     <w:sectPr>

</xml_diff>